<commit_message>
docs: add project documentation and setup guides
- Update CHAPTER-3.docx with latest project documentation
- Add JULIUS_MAC_SETUP_GUIDE.docx for macOS development setup
- Include build_chapter3.py script for documentation generation

Co-Authored-By: Claude Opus 4.6 <noreply@anthropic.com>
</commit_message>
<xml_diff>
--- a/docs/CHAPTER-3.docx
+++ b/docs/CHAPTER-3.docx
@@ -256,7 +256,23 @@
           <w:rFonts w:ascii="Times New Roman" w:hAnsi="Times New Roman"/>
           <w:sz w:val="24"/>
         </w:rPr>
-        <w:t>. Ghana's primary healthcare delivery is organised around catchment areas</w:t>
+        <w:t xml:space="preserve">. Ghana's primary healthcare delivery is </w:t>
+      </w:r>
+      <w:proofErr w:type="spellStart"/>
+      <w:r>
+        <w:rPr>
+          <w:rFonts w:ascii="Times New Roman" w:hAnsi="Times New Roman"/>
+          <w:sz w:val="24"/>
+        </w:rPr>
+        <w:t>organised</w:t>
+      </w:r>
+      <w:proofErr w:type="spellEnd"/>
+      <w:r>
+        <w:rPr>
+          <w:rFonts w:ascii="Times New Roman" w:hAnsi="Times New Roman"/>
+          <w:sz w:val="24"/>
+        </w:rPr>
+        <w:t xml:space="preserve"> around catchment areas</w:t>
       </w:r>
       <w:r>
         <w:rPr>
@@ -922,6 +938,7 @@
         </w:rPr>
         <w:t xml:space="preserve">is written into the </w:t>
       </w:r>
+      <w:proofErr w:type="spellStart"/>
       <w:r>
         <w:rPr>
           <w:rFonts w:ascii="Courier New" w:hAnsi="Courier New"/>
@@ -930,6 +947,7 @@
         </w:rPr>
         <w:t>vaccinationQueue</w:t>
       </w:r>
+      <w:proofErr w:type="spellEnd"/>
       <w:r>
         <w:rPr>
           <w:rFonts w:ascii="Times New Roman" w:hAnsi="Times New Roman"/>
@@ -1010,6 +1028,7 @@
         </w:rPr>
         <w:t xml:space="preserve">. This singleton service runs on a five-minute polling interval and also listens for the browser's </w:t>
       </w:r>
+      <w:proofErr w:type="spellStart"/>
       <w:r>
         <w:rPr>
           <w:rFonts w:ascii="Times New Roman" w:hAnsi="Times New Roman" w:cs="Times New Roman"/>
@@ -1028,6 +1047,7 @@
         </w:rPr>
         <w:t>.online</w:t>
       </w:r>
+      <w:proofErr w:type="spellEnd"/>
       <w:r>
         <w:rPr>
           <w:rFonts w:ascii="Times New Roman" w:hAnsi="Times New Roman"/>
@@ -1165,6 +1185,7 @@
         </w:rPr>
         <w:t xml:space="preserve">including </w:t>
       </w:r>
+      <w:proofErr w:type="spellStart"/>
       <w:r>
         <w:rPr>
           <w:rFonts w:ascii="Courier New" w:hAnsi="Courier New"/>
@@ -1173,6 +1194,7 @@
         </w:rPr>
         <w:t>fullName</w:t>
       </w:r>
+      <w:proofErr w:type="spellEnd"/>
       <w:r>
         <w:rPr>
           <w:rFonts w:ascii="Times New Roman" w:hAnsi="Times New Roman"/>
@@ -1180,6 +1202,7 @@
         </w:rPr>
         <w:t xml:space="preserve">, </w:t>
       </w:r>
+      <w:proofErr w:type="spellStart"/>
       <w:r>
         <w:rPr>
           <w:rFonts w:ascii="Courier New" w:hAnsi="Courier New"/>
@@ -1188,6 +1211,7 @@
         </w:rPr>
         <w:t>dateOfBirth</w:t>
       </w:r>
+      <w:proofErr w:type="spellEnd"/>
       <w:r>
         <w:rPr>
           <w:rFonts w:ascii="Times New Roman" w:hAnsi="Times New Roman"/>
@@ -1195,6 +1219,7 @@
         </w:rPr>
         <w:t xml:space="preserve">, </w:t>
       </w:r>
+      <w:proofErr w:type="spellStart"/>
       <w:r>
         <w:rPr>
           <w:rFonts w:ascii="Courier New" w:hAnsi="Courier New"/>
@@ -1203,6 +1228,7 @@
         </w:rPr>
         <w:t>guardianName</w:t>
       </w:r>
+      <w:proofErr w:type="spellEnd"/>
       <w:r>
         <w:rPr>
           <w:rFonts w:ascii="Times New Roman" w:hAnsi="Times New Roman"/>
@@ -1210,6 +1236,7 @@
         </w:rPr>
         <w:t xml:space="preserve">, and </w:t>
       </w:r>
+      <w:proofErr w:type="spellStart"/>
       <w:r>
         <w:rPr>
           <w:rFonts w:ascii="Courier New" w:hAnsi="Courier New"/>
@@ -1218,6 +1245,7 @@
         </w:rPr>
         <w:t>guardianPhone</w:t>
       </w:r>
+      <w:proofErr w:type="spellEnd"/>
       <w:r>
         <w:rPr>
           <w:rFonts w:ascii="Times New Roman" w:hAnsi="Times New Roman"/>
@@ -1900,7 +1928,23 @@
           <w:rFonts w:ascii="Times New Roman" w:hAnsi="Times New Roman"/>
           <w:sz w:val="24"/>
         </w:rPr>
-        <w:t>Data visualisation in the dashboards</w:t>
+        <w:t xml:space="preserve">Data </w:t>
+      </w:r>
+      <w:proofErr w:type="spellStart"/>
+      <w:r>
+        <w:rPr>
+          <w:rFonts w:ascii="Times New Roman" w:hAnsi="Times New Roman"/>
+          <w:sz w:val="24"/>
+        </w:rPr>
+        <w:t>visualisation</w:t>
+      </w:r>
+      <w:proofErr w:type="spellEnd"/>
+      <w:r>
+        <w:rPr>
+          <w:rFonts w:ascii="Times New Roman" w:hAnsi="Times New Roman"/>
+          <w:sz w:val="24"/>
+        </w:rPr>
+        <w:t xml:space="preserve"> in the dashboards</w:t>
       </w:r>
       <w:r>
         <w:rPr>
@@ -3439,7 +3483,35 @@
           <w:rFonts w:ascii="Times New Roman" w:hAnsi="Times New Roman"/>
           <w:sz w:val="24"/>
         </w:rPr>
-        <w:t xml:space="preserve"> value stored in the database, which encodes a URL to the PHA certificate verification endpoint. This means that any party—a school admissions officer, a travel health clinic, or another healthcare provider—can independently verify the certificate's authenticity by scanning the QR code on the printed document, without relying on the issuing facility's paper records. The completed PDF is offered as a direct browser download named using the certificate ID.</w:t>
+        <w:t xml:space="preserve"> value stored in the database, which encodes a URL to the PHA certificate verification endpoint. This means that any party</w:t>
+      </w:r>
+      <w:r>
+        <w:rPr>
+          <w:rFonts w:ascii="Times New Roman" w:hAnsi="Times New Roman"/>
+          <w:sz w:val="24"/>
+        </w:rPr>
+        <w:t xml:space="preserve">, </w:t>
+      </w:r>
+      <w:r>
+        <w:rPr>
+          <w:rFonts w:ascii="Times New Roman" w:hAnsi="Times New Roman"/>
+          <w:sz w:val="24"/>
+        </w:rPr>
+        <w:t>a school admissions officer, a travel health clinic, or another healthcare provider</w:t>
+      </w:r>
+      <w:r>
+        <w:rPr>
+          <w:rFonts w:ascii="Times New Roman" w:hAnsi="Times New Roman"/>
+          <w:sz w:val="24"/>
+        </w:rPr>
+        <w:t xml:space="preserve"> </w:t>
+      </w:r>
+      <w:r>
+        <w:rPr>
+          <w:rFonts w:ascii="Times New Roman" w:hAnsi="Times New Roman"/>
+          <w:sz w:val="24"/>
+        </w:rPr>
+        <w:t>can independently verify the certificate's authenticity by scanning the QR code on the printed document, without relying on the issuing facility's paper records. The completed PDF is offered as a direct browser download named using the certificate ID.</w:t>
       </w:r>
     </w:p>
     <w:p>
@@ -3651,7 +3723,35 @@
           <w:rFonts w:ascii="Times New Roman" w:hAnsi="Times New Roman"/>
           <w:sz w:val="24"/>
         </w:rPr>
-        <w:t>Testing the CHW offline module required a different approach from the rest of the system, because the failure mode being tested—losing network connectivity mid-session—cannot be replicated by simply submitting a bad form value. The team used the browser's DevTools Network panel to simulate offline conditions by setting the network throttling preset to "Offline" while the CHW dashboard was active.</w:t>
+        <w:t>Testing the CHW offline module required a different approach from the rest of the system, because the failure mode being tested</w:t>
+      </w:r>
+      <w:r>
+        <w:rPr>
+          <w:rFonts w:ascii="Times New Roman" w:hAnsi="Times New Roman"/>
+          <w:sz w:val="24"/>
+        </w:rPr>
+        <w:t xml:space="preserve"> </w:t>
+      </w:r>
+      <w:r>
+        <w:rPr>
+          <w:rFonts w:ascii="Times New Roman" w:hAnsi="Times New Roman"/>
+          <w:sz w:val="24"/>
+        </w:rPr>
+        <w:t>losing network connectivity mid-session</w:t>
+      </w:r>
+      <w:r>
+        <w:rPr>
+          <w:rFonts w:ascii="Times New Roman" w:hAnsi="Times New Roman"/>
+          <w:sz w:val="24"/>
+        </w:rPr>
+        <w:t xml:space="preserve"> </w:t>
+      </w:r>
+      <w:r>
+        <w:rPr>
+          <w:rFonts w:ascii="Times New Roman" w:hAnsi="Times New Roman"/>
+          <w:sz w:val="24"/>
+        </w:rPr>
+        <w:t>cannot be replicated by simply submitting a bad form value. The team used the browser's DevTools Network panel to simulate offline conditions by setting the network throttling preset to "Offline" while the CHW dashboard was active.</w:t>
       </w:r>
     </w:p>
     <w:p>
@@ -3917,7 +4017,63 @@
           <w:rFonts w:ascii="Times New Roman" w:hAnsi="Times New Roman"/>
           <w:sz w:val="24"/>
         </w:rPr>
-        <w:t>This chapter has documented the methodology and design decisions that underpin the CVCC system. The semi-structured interview process [2] surfaced the field constraints—network unavailability, catchment area rules, and cross-facility transfers—that directly shaped the architecture. The Agile methodology [1] allowed the three-person team to deliver functional role slices incrementally and to incorporate discoveries from each iteration into the next. The three-tier architecture (Next.js [4] PWA, NestJS [6] API, Supabase PostgreSQL [14]) provides a clean and maintainable separation of concerns, while the offline-first CHW module—built on Dexie.js [10], two purpose-built service workers, and AES-GCM-256 field encryption [20]—ensures that data collection continues reliably even in the most resource-constrained environments. The role-based access control system, enforced at the JWT [21], API guard, and RLS levels simultaneously, guarantees that the seven user roles remain securely isolated from one another. Together, the technology stack and architectural choices described here provided a solid and well-evidenced foundation for the implementation phase described in Chapter Four.</w:t>
+        <w:t>This chapter has documented the methodology and design decisions that underpin the CVCC system. The semi-structured interview process [2] surfaced the field constraints</w:t>
+      </w:r>
+      <w:r>
+        <w:rPr>
+          <w:rFonts w:ascii="Times New Roman" w:hAnsi="Times New Roman"/>
+          <w:sz w:val="24"/>
+        </w:rPr>
+        <w:t xml:space="preserve"> </w:t>
+      </w:r>
+      <w:r>
+        <w:rPr>
+          <w:rFonts w:ascii="Times New Roman" w:hAnsi="Times New Roman"/>
+          <w:sz w:val="24"/>
+        </w:rPr>
+        <w:t>network unavailability, catchment area rules, and cross-facility transfers</w:t>
+      </w:r>
+      <w:r>
+        <w:rPr>
+          <w:rFonts w:ascii="Times New Roman" w:hAnsi="Times New Roman"/>
+          <w:sz w:val="24"/>
+        </w:rPr>
+        <w:t xml:space="preserve">, </w:t>
+      </w:r>
+      <w:r>
+        <w:rPr>
+          <w:rFonts w:ascii="Times New Roman" w:hAnsi="Times New Roman"/>
+          <w:sz w:val="24"/>
+        </w:rPr>
+        <w:t>that directly shaped the architecture. The Agile methodology [1] allowed the three-person team to deliver functional role slices incrementally and to incorporate discoveries from each iteration into the next. The three-tier architecture (Next.js [4] PWA, NestJS [6] API, Supabase PostgreSQL [14]) provides a clean and maintainable separation of concerns, while the offline-first CHW module</w:t>
+      </w:r>
+      <w:r>
+        <w:rPr>
+          <w:rFonts w:ascii="Times New Roman" w:hAnsi="Times New Roman"/>
+          <w:sz w:val="24"/>
+        </w:rPr>
+        <w:t xml:space="preserve"> </w:t>
+      </w:r>
+      <w:r>
+        <w:rPr>
+          <w:rFonts w:ascii="Times New Roman" w:hAnsi="Times New Roman"/>
+          <w:sz w:val="24"/>
+        </w:rPr>
+        <w:t>built on Dexie.js [10], two purpose-built service workers, and AES-GCM-256 field encryption [20]</w:t>
+      </w:r>
+      <w:r>
+        <w:rPr>
+          <w:rFonts w:ascii="Times New Roman" w:hAnsi="Times New Roman"/>
+          <w:sz w:val="24"/>
+        </w:rPr>
+        <w:t xml:space="preserve">, </w:t>
+      </w:r>
+      <w:r>
+        <w:rPr>
+          <w:rFonts w:ascii="Times New Roman" w:hAnsi="Times New Roman"/>
+          <w:sz w:val="24"/>
+        </w:rPr>
+        <w:t>ensures that data collection continues reliably even in the most resource-constrained environments. The role-based access control system, enforced at the JWT [21], API guard, and RLS levels simultaneously, guarantees that the seven user roles remain securely isolated from one another. Together, the technology stack and architectural choices described here provided a solid and well-evidenced foundation for the implementation phase described in Chapter Four.</w:t>
       </w:r>
     </w:p>
     <w:p>

</xml_diff>